<commit_message>
fix(alertas+reorden): orden Agotado/Bajo, badge de prioridad rotación, cap 200 SKUs Reorden
Segunda ronda de verificación del manual de admin (5 agentes en paralelo)
encontró 3 bugs reales, no solo texto:
- fn_dashboard_kpis + Alertas.jsx + Dashboard.jsx ordenaban alertas por
  estado_stock alfabético descendente ('Bajo' > 'Agotado' como texto),
  mostrando lo menos urgente primero.
- Alertas.jsx: badge visible en pestañas de rotación ("Alta"/"Baja") no
  coincidía con el bucket real del filtro de prioridad.
- Reorden.jsx: límite silencioso de 200 SKUs en v_sugerencias_reorden
  podía subcontar los KPIs sin avisar, en un catálogo de ~3.000 productos.

También corrige el manual (docs/manual-panel-administrador.md +.docx) con
los hallazgos de la verificación: color real del badge de Slotting, texto
exacto de permisos de Admin, umbral configurable de OT>30 días, Top10
incluye ventas de OT, y varias aclaraciones menores más.
</commit_message>
<xml_diff>
--- a/docs/Manual-Panel-Administrador-CDV.docx
+++ b/docs/Manual-Panel-Administrador-CDV.docx
@@ -1106,6 +1106,22 @@
         <w:pStyle w:val="ListBullet"/>
       </w:pPr>
       <w:r>
+        <w:t>La pestaña "OT &gt; 30 días sin recoger" usa un número configurable (el parámetro "días para alerta de OT abandonada" en Configuración → Parámetros, 30 por defecto) — si alguien lo cambia, la pestaña sigue mostrando el texto fijo "OT &gt; 30 días" aunque en realidad esté avisando con el nuevo número de días.</w:t>
+      </w:r>
+    </w:p>
+    <w:p>
+      <w:pPr>
+        <w:pStyle w:val="ListBullet"/>
+      </w:pPr>
+      <w:r>
+        <w:t>En las pestañas "Mayor rotación", "Menor rotación" y "Sobre-stock" verás etiquetas descriptivas propias ("Alta", "Baja", "Revisar") en vez de "Urgente/Alta/Media" — describen la fila, no necesariamente coinciden con el nombre exacto del filtro de prioridad que las agrupa por dentro.</w:t>
+      </w:r>
+    </w:p>
+    <w:p>
+      <w:pPr>
+        <w:pStyle w:val="ListBullet"/>
+      </w:pPr>
+      <w:r>
         <w:t xml:space="preserve">"Sobre-stock" y "Menor/Mayor rotación" siempre miran los </w:t>
       </w:r>
       <w:r>
@@ -1811,6 +1827,31 @@
     </w:p>
     <w:p>
       <w:pPr>
+        <w:pStyle w:val="ListBullet"/>
+      </w:pPr>
+      <w:r>
+        <w:t xml:space="preserve">A diferencia del KPI "Ventas" del Dashboard (que excluye las ventas de Órdenes de Trabajo), </w:t>
+      </w:r>
+      <w:r>
+        <w:rPr>
+          <w:b/>
+        </w:rPr>
+        <w:t>las cuatro pestañas de Top 10 sí incluyen las ventas hechas dentro de una OT</w:t>
+      </w:r>
+      <w:r>
+        <w:t xml:space="preserve"> — no hay inconsistencia entre las cuatro, solo con el Dashboard.</w:t>
+      </w:r>
+    </w:p>
+    <w:p>
+      <w:pPr>
+        <w:pStyle w:val="ListBullet"/>
+      </w:pPr>
+      <w:r>
+        <w:t>En periodos largos ("Último año") con mucho volumen de ventas, el cálculo trae un límite interno de filas para no sobrecargar la consulta; en un negocio con miles de transacciones al año esto en teoría podría dejar alguna fuera del ranking, aunque es poco probable que afecte el Top 10 real en la práctica.</w:t>
+      </w:r>
+    </w:p>
+    <w:p>
+      <w:pPr>
         <w:pStyle w:val="Heading2"/>
       </w:pPr>
       <w:r>
@@ -2199,7 +2240,7 @@
         <w:pStyle w:val="ListNumber"/>
       </w:pPr>
       <w:r>
-        <w:t>Al abrirse, el sistema calcula automáticamente, para todos los productos, cuál debería ser su mínimo y máximo ideal, usando la demanda real de los últimos 90 días (ventas + consumo en Órdenes de Trabajo + consumo en Ensambles).</w:t>
+        <w:t>Al abrirse, el sistema calcula automáticamente, para los productos que sí tuvieron demanda en los últimos 90 días (ventas + consumo en Órdenes de Trabajo + consumo en Ensambles), cuál debería ser su mínimo y máximo ideal. Un producto sin ningún movimiento en ese periodo no aparece en el asistente — si no hay ninguno con demanda, verás el aviso "Sin demanda registrada en el periodo".</w:t>
       </w:r>
     </w:p>
     <w:p>
@@ -2471,6 +2512,14 @@
     </w:p>
     <w:p>
       <w:pPr>
+        <w:pStyle w:val="ListBullet"/>
+      </w:pPr>
+      <w:r>
+        <w:t>Si alguna vez el número de SKUs bajo el mínimo es tan grande que no caben todos en la lista, aparece un aviso amarillo arriba indicando cuántos se están mostrando de cuántos hay en total — así los KPIs de arriba nunca se ven completos sin que te avises.</w:t>
+      </w:r>
+    </w:p>
+    <w:p>
+      <w:pPr>
         <w:pStyle w:val="Heading2"/>
       </w:pPr>
       <w:r>
@@ -2659,7 +2708,7 @@
         <w:t>Asignar ubicación</w:t>
       </w:r>
       <w:r>
-        <w:t xml:space="preserve"> (naranja claro/azul — el producto no tenía ubicación y se le da una por primera vez), </w:t>
+        <w:t xml:space="preserve"> (azul — el producto no tenía ubicación y se le da una por primera vez), </w:t>
       </w:r>
       <w:r>
         <w:rPr>
@@ -2886,7 +2935,58 @@
         <w:pStyle w:val="ListBullet"/>
       </w:pPr>
       <w:r>
-        <w:t>El color naranja resalta "Subir" y "Asignar ubicación" (acciones de mayor impacto en eficiencia); "Bajar" se muestra en gris, con menor urgencia visual.</w:t>
+        <w:t>Cada acción tiene su color: "Subir" en naranja (mover ahora, alta rotación lejos de la puerta), "Asignar ubicación" en azul (informativo — el producto no tenía ubicación), "Bajar" en gris (menor urgencia, casi no rota).</w:t>
+      </w:r>
+    </w:p>
+    <w:p>
+      <w:pPr>
+        <w:pStyle w:val="ListBullet"/>
+      </w:pPr>
+      <w:r>
+        <w:t>Si en algún momento la lista aparece vacía (sin ninguna sugerencia), significa que los productos ya están bien ubicados según su rotación actual — no es un error de carga.</w:t>
+      </w:r>
+    </w:p>
+    <w:p>
+      <w:pPr>
+        <w:pStyle w:val="ListBullet"/>
+      </w:pPr>
+      <w:r>
+        <w:t xml:space="preserve">Solo se consideran productos </w:t>
+      </w:r>
+      <w:r>
+        <w:rPr>
+          <w:b/>
+        </w:rPr>
+        <w:t>activos</w:t>
+      </w:r>
+      <w:r>
+        <w:t xml:space="preserve"> en el catálogo — un producto descontinuado no genera sugerencia aunque haya tenido demanda en el pasado.</w:t>
+      </w:r>
+    </w:p>
+    <w:p>
+      <w:pPr>
+        <w:pStyle w:val="ListBullet"/>
+      </w:pPr>
+      <w:r>
+        <w:t xml:space="preserve">Para que aparezca la sugerencia "Asignar ubicación", el producto necesita ya tener una fila de inventario en esa sede (aunque sea con </w:t>
+      </w:r>
+      <w:r>
+        <w:rPr>
+          <w:rFonts w:ascii="Consolas" w:hAnsi="Consolas"/>
+          <w:sz w:val="20"/>
+        </w:rPr>
+        <w:t>ubicacion_id</w:t>
+      </w:r>
+      <w:r>
+        <w:t xml:space="preserve"> vacío). Si un producto nunca se ha registrado en el inventario de una sede, Slotting no lo va a sugerir ahí hasta que exista ese registro.</w:t>
+      </w:r>
+    </w:p>
+    <w:p>
+      <w:pPr>
+        <w:pStyle w:val="ListBullet"/>
+      </w:pPr>
+      <w:r>
+        <w:t>El contador de sugerencias del encabezado siempre cuenta el total de todas las sedes, aunque tengas el filtro de sede activo mostrando solo una — no te preocupes si el número de arriba no coincide con las filas que ves en la tabla filtrada.</w:t>
       </w:r>
     </w:p>
     <w:p>
@@ -4048,7 +4148,7 @@
         <w:t>Falta el histórico completo para Bodega</w:t>
       </w:r>
       <w:r>
-        <w:t>: aunque Bodega puede previsualizar un cierre, la lista de "Cierres registrados" y el detalle de cierres pasados de esta pantalla solo los ve el Admin — es una restricción de la base de datos, no un botón oculto que se pueda activar.</w:t>
+        <w:t>: aunque Bodega puede previsualizar un cierre, la lista de "Cierres registrados" y el detalle de cierres pasados de esta pantalla solo los ve el Admin — es una restricción de la base de datos, no un botón oculto que se pueda activar. Ojo: la pantalla de Bodega no muestra un aviso de "no autorizado" — simplemente ve los indicadores en cero ("Cierres registrados: 0", etc.) y el histórico vacío, como si nunca se hubiera generado ningún cierre. Si un Bodeguero pregunta por qué no ve cierres pasados que tú sí generaste, es por este permiso, no porque se hayan perdido.</w:t>
       </w:r>
     </w:p>
     <w:p>
@@ -5343,10 +5443,10 @@
         <w:rPr>
           <w:b/>
         </w:rPr>
-        <w:t>ningún Admin puede desactivar su propia cuenta ni cambiar su propio rol/sede, nunca — así tenga compañía de otros Admin activos o no.</w:t>
-      </w:r>
-      <w:r>
-        <w:t xml:space="preserve"> No es una excepción solo para "el último administrador que queda"; es una regla fija pensada para que nadie se saque a sí mismo por error. Si de verdad hay que hacer ese cambio, tiene que hacerlo OTRO usuario con rol Admin.</w:t>
+        <w:t>ningún Admin puede desactivar su propia cuenta, nunca — así tenga compañía de otros Admin activos o no.</w:t>
+      </w:r>
+      <w:r>
+        <w:t xml:space="preserve"> El bloqueo real (en el servidor y en la pantalla) aplica siempre a cualquier Admin que se intente desactivar a sí mismo, no solo a "el último administrador que queda". Eso sí: el botón de encendido/apagado solo aparece visualmente "bloqueado" con el mensaje "Eres el único Admin activo" cuando de verdad eres el único Admin activo — si hay otros Admin activos, tu propio botón se ve habilitado, pero al pulsarlo igual te va a rechazar la acción con el mismo mensaje de anti-bloqueo. Si de verdad hay que desactivar o cambiar el rol de un Admin, tiene que hacerlo OTRO usuario con rol Admin.</w:t>
       </w:r>
     </w:p>
     <w:p>
@@ -5385,7 +5485,7 @@
         <w:t>Admin</w:t>
       </w:r>
       <w:r>
-        <w:t xml:space="preserve"> — ve y hace todo; </w:t>
+        <w:t xml:space="preserve"> — Acceso completo · /ops + /admin; </w:t>
       </w:r>
       <w:r>
         <w:rPr>

</xml_diff>